<commit_message>
Update resume with AWS AI Practitioner cert
</commit_message>
<xml_diff>
--- a/public/resume/Giovanni_Tammaro_Resume.docx
+++ b/public/resume/Giovanni_Tammaro_Resume.docx
@@ -2193,6 +2193,14 @@
     </w:p>
     <w:p>
       <w:pPr>
+        <w:spacing w:before="0" w:after="40" w:line="240" w:lineRule="auto"/>
+      </w:pPr>
+      <w:r>
+        <w:t>AWS Certified AI Practitioner. with credential ID Credential ID 529856606</w:t>
+      </w:r>
+    </w:p>
+    <w:p>
+      <w:pPr>
         <w:pStyle w:val="normal1"/>
         <w:spacing w:lineRule="auto" w:line="240" w:before="0" w:after="40"/>
         <w:rPr/>

</xml_diff>

<commit_message>
Update resume: add GenAI certifications, strengthen experience bullets, improve layout to 2 pages
Co-Authored-By: Claude Sonnet 4.6 <noreply@anthropic.com>
</commit_message>
<xml_diff>
--- a/public/resume/Giovanni_Tammaro_Resume.docx
+++ b/public/resume/Giovanni_Tammaro_Resume.docx
@@ -5,7 +5,7 @@
     <w:p>
       <w:pPr>
         <w:pStyle w:val="normal1"/>
-        <w:spacing w:lineRule="auto" w:line="240" w:before="0" w:after="0"/>
+        <w:spacing w:lineRule="auto" w:line="240" w:before="0" w:after="40"/>
         <w:jc w:val="center"/>
         <w:rPr/>
       </w:pPr>
@@ -23,12 +23,12 @@
     <w:p>
       <w:pPr>
         <w:pStyle w:val="normal1"/>
-        <w:spacing w:lineRule="auto" w:line="240" w:before="0" w:after="0"/>
+        <w:spacing w:lineRule="auto" w:line="240" w:before="0" w:after="40"/>
         <w:jc w:val="center"/>
         <w:rPr/>
       </w:pPr>
       <w:r>
-        <w:t>AWS Solutions Architect | AI Platform Engineer</w:t>
+        <w:t>AWS Cloud &amp; AI Engineer | GenAI Platform Specialist</w:t>
       </w:r>
     </w:p>
     <w:p>
@@ -39,10 +39,7 @@
         <w:rPr/>
       </w:pPr>
       <w:r>
-        <w:rPr>
-          <w:sz w:val="18"/>
-        </w:rPr>
-        <w:t>Portugal (Remote) | Email: giovannitammaro76@gmail.com</w:t>
+        <w:t>Remote | EU  |  Email: giovannitammaro76@gmail.com</w:t>
       </w:r>
     </w:p>
     <w:p>
@@ -72,24 +69,27 @@
     </w:p>
     <w:p>
       <w:pPr>
+        <w:spacing w:before="0" w:after="20" w:line="240" w:lineRule="auto"/>
         <w:jc w:val="center"/>
       </w:pPr>
       <w:r>
         <w:rPr>
           <w:sz w:val="18"/>
         </w:rPr>
-        <w:t xml:space="preserve">Portfolio: </w:t>
+        <w:t>Portfolio &amp; GitHub: https://giovannitammaroaws.github.io/portfolio/</w:t>
       </w:r>
-      <w:hyperlink r:id="rId12">
-        <w:r>
-          <w:rPr>
-            <w:sz w:val="18"/>
-            <w:szCs w:val="18"/>
-            <w:u w:val="none"/>
-          </w:rPr>
-          <w:t>https://giovannitammaroaws.github.io/portfolio/</w:t>
-        </w:r>
-      </w:hyperlink>
+    </w:p>
+    <w:p>
+      <w:pPr>
+        <w:spacing w:before="0" w:after="20" w:line="240" w:lineRule="auto"/>
+        <w:jc w:val="center"/>
+      </w:pPr>
+      <w:r>
+        <w:rPr>
+          <w:sz w:val="18"/>
+        </w:rPr>
+        <w:t>Medium: https://medium.com/@giovannitammaro76</w:t>
+      </w:r>
     </w:p>
     <w:p>
       <w:pPr>
@@ -118,7 +118,7 @@
         <w:rPr>
           <w:rFonts w:ascii="Calibri" w:hAnsi="Calibri"/>
         </w:rPr>
-        <w:t>Network Engineer with over 15 years of experience across several IT domains and AWS cloud knowledge. Background in network automation, cloud infrastructure, Kubernetes, CI/CD pipelines, and Linux systems. Over the last four years, I have also worked as a Quantitative Researcher (Freelance), designing and operating automated trading systems on AWS with a focus on risk management.</w:t>
+        <w:t>AWS-Certified Cloud &amp; AI Engineer with 15+ years of infrastructure experience, including 4 years as Network Development Engineer at Amazon Web Services (Dublin). Hands-on delivery of production GenAI systems on AWS Bedrock, cloud-native EKS platforms with Istio service mesh and Argo Rollouts, and infrastructure as code with Terraform. Comfortable operating autonomously in large international remote environments - from architecture to production with minimal oversight.</w:t>
       </w:r>
     </w:p>
     <w:p>
@@ -168,9 +168,17 @@
       </w:pPr>
       <w:r>
         <w:rPr>
+          <w:b/>
           <w:sz w:val="21"/>
         </w:rPr>
-        <w:t>Cloud Platforms: AWS (VPC, IAM, EC2, EKS, S3, Route 53, Bedrock, Lambda)</w:t>
+        <w:t>Cloud Platforms:</w:t>
+      </w:r>
+      <w:r>
+        <w:rPr>
+          <w:b w:val="0"/>
+          <w:sz w:val="21"/>
+        </w:rPr>
+        <w:t xml:space="preserve"> AWS (VPC, IAM, EC2, EKS, S3, Route 53, Bedrock, Lambda)</w:t>
       </w:r>
     </w:p>
     <w:p>
@@ -181,9 +189,17 @@
       </w:pPr>
       <w:r>
         <w:rPr>
+          <w:b/>
           <w:sz w:val="21"/>
         </w:rPr>
-        <w:t>Containers &amp; Orchestration: Docker, Kubernetes, Helm</w:t>
+        <w:t>Containers &amp; Orchestration:</w:t>
+      </w:r>
+      <w:r>
+        <w:rPr>
+          <w:b w:val="0"/>
+          <w:sz w:val="21"/>
+        </w:rPr>
+        <w:t xml:space="preserve"> Docker, Kubernetes, Helm</w:t>
       </w:r>
     </w:p>
     <w:p>
@@ -193,7 +209,16 @@
         <w:rPr/>
       </w:pPr>
       <w:r>
-        <w:t>Automation &amp; DevOps: Python, CI/CD, GitHub Actions, Jenkins, AWS CodePipeline, Ansible</w:t>
+        <w:rPr>
+          <w:b/>
+        </w:rPr>
+        <w:t>DevOps:</w:t>
+      </w:r>
+      <w:r>
+        <w:rPr>
+          <w:b w:val="0"/>
+        </w:rPr>
+        <w:t xml:space="preserve"> Python, CI/CD, GitHub Actions, Jenkins, AWS CodePipeline, ArgoCD, Argo Rollouts, Istio / Kiali, Terraform, Prometheus, Grafana, Git</w:t>
       </w:r>
     </w:p>
     <w:p>
@@ -204,9 +229,17 @@
       </w:pPr>
       <w:r>
         <w:rPr>
+          <w:b/>
           <w:sz w:val="21"/>
         </w:rPr>
-        <w:t>Operating Systems: Linux (Ubuntu, Amazon Linux)</w:t>
+        <w:t>Operating Systems:</w:t>
+      </w:r>
+      <w:r>
+        <w:rPr>
+          <w:b w:val="0"/>
+          <w:sz w:val="21"/>
+        </w:rPr>
+        <w:t xml:space="preserve"> Linux (Ubuntu, Amazon Linux)</w:t>
       </w:r>
     </w:p>
     <w:p>
@@ -217,9 +250,17 @@
       </w:pPr>
       <w:r>
         <w:rPr>
+          <w:b/>
           <w:sz w:val="21"/>
         </w:rPr>
-        <w:t>Security: IAM, GuardDuty, Inspector, DevSecOps, Network Security</w:t>
+        <w:t>Security:</w:t>
+      </w:r>
+      <w:r>
+        <w:rPr>
+          <w:b w:val="0"/>
+          <w:sz w:val="21"/>
+        </w:rPr>
+        <w:t xml:space="preserve"> GuardDuty, Inspector, DevSecOps, Network Security</w:t>
       </w:r>
     </w:p>
     <w:p>
@@ -230,9 +271,17 @@
       </w:pPr>
       <w:r>
         <w:rPr>
+          <w:b/>
           <w:sz w:val="21"/>
         </w:rPr>
-        <w:t>Networking: TCP/IP, Routing, Load Balancing, Distributed Systems</w:t>
+        <w:t>Networking:</w:t>
+      </w:r>
+      <w:r>
+        <w:rPr>
+          <w:b w:val="0"/>
+          <w:sz w:val="21"/>
+        </w:rPr>
+        <w:t xml:space="preserve"> TCP/IP, Routing, Load Balancing, Distributed Systems</w:t>
       </w:r>
     </w:p>
     <w:p>
@@ -326,7 +375,7 @@
           <w:sz w:val="21"/>
           <w:szCs w:val="21"/>
         </w:rPr>
-        <w:t>Jan 2024 - Present</w:t>
+        <w:t>Jan 2022 - Present</w:t>
       </w:r>
     </w:p>
     <w:p>
@@ -341,7 +390,29 @@
           <w:numId w:val="1"/>
         </w:numPr>
         <w:shd w:val="clear" w:fill="auto"/>
-        <w:spacing w:lineRule="exact" w:line="283" w:before="0" w:after="0"/>
+        <w:spacing w:lineRule="exact" w:line="283" w:before="0" w:after="40"/>
+        <w:ind w:hanging="360" w:start="288" w:end="0"/>
+        <w:contextualSpacing/>
+        <w:jc w:val="start"/>
+        <w:rPr/>
+      </w:pPr>
+      <w:r>
+        <w:t>Built a production RAG pipeline on AWS Bedrock (Anthropic Claude, Amazon Titan) with pgvector semantic retrieval, multi-provider LLM routing, and source-attributed responses, designed for financial document Q&amp;A at scale.</w:t>
+      </w:r>
+    </w:p>
+    <w:p>
+      <w:pPr>
+        <w:pStyle w:val="normal1"/>
+        <w:keepNext w:val="false"/>
+        <w:keepLines w:val="false"/>
+        <w:pageBreakBefore w:val="false"/>
+        <w:widowControl/>
+        <w:numPr>
+          <w:ilvl w:val="0"/>
+          <w:numId w:val="1"/>
+        </w:numPr>
+        <w:shd w:val="clear" w:fill="auto"/>
+        <w:spacing w:lineRule="exact" w:line="283" w:before="0" w:after="40"/>
         <w:ind w:hanging="360" w:start="288" w:end="0"/>
         <w:contextualSpacing/>
         <w:jc w:val="start"/>
@@ -366,29 +437,27 @@
           <w:shd w:fill="auto" w:val="clear"/>
           <w:vertAlign w:val="baseline"/>
         </w:rPr>
-        <w:t xml:space="preserve">Designed and operated cloud-native workloads on </w:t>
+        <w:t>Deployed and operated EKS clusters with Istio service mesh and Kiali observability - implemented canary and blue/green traffic shifting via Argo Rollouts with automated rollback on failure.</w:t>
       </w:r>
-      <w:r>
-        <w:rPr>
-          <w:rFonts w:eastAsia="Calibri" w:cs="Calibri"/>
-          <w:b/>
-          <w:bCs/>
-          <w:i w:val="false"/>
-          <w:iCs w:val="false"/>
-          <w:caps w:val="false"/>
-          <w:smallCaps w:val="false"/>
-          <w:strike w:val="false"/>
-          <w:dstrike w:val="false"/>
-          <w:color w:val="000000"/>
-          <w:position w:val="0"/>
-          <w:sz w:val="21"/>
-          <w:szCs w:val="20"/>
-          <w:u w:val="none"/>
-          <w:shd w:fill="auto" w:val="clear"/>
-          <w:vertAlign w:val="baseline"/>
-        </w:rPr>
-        <w:t>AWS</w:t>
-      </w:r>
+    </w:p>
+    <w:p>
+      <w:pPr>
+        <w:pStyle w:val="normal1"/>
+        <w:keepNext w:val="false"/>
+        <w:keepLines w:val="false"/>
+        <w:pageBreakBefore w:val="false"/>
+        <w:widowControl/>
+        <w:numPr>
+          <w:ilvl w:val="0"/>
+          <w:numId w:val="1"/>
+        </w:numPr>
+        <w:shd w:val="clear" w:fill="auto"/>
+        <w:spacing w:lineRule="exact" w:line="283" w:before="0" w:after="40"/>
+        <w:ind w:hanging="360" w:start="288" w:end="0"/>
+        <w:contextualSpacing/>
+        <w:jc w:val="start"/>
+        <w:rPr/>
+      </w:pPr>
       <w:r>
         <w:rPr>
           <w:rFonts w:eastAsia="Calibri" w:cs="Calibri"/>
@@ -408,7 +477,7 @@
           <w:shd w:fill="auto" w:val="clear"/>
           <w:vertAlign w:val="baseline"/>
         </w:rPr>
-        <w:t xml:space="preserve"> with cost optimization and observability.</w:t>
+        <w:t>Implemented GitOps delivery with ArgoCD for declarative EKS deployments and AWS CodePipeline for container build &amp; push - eliminating manual release steps and enforcing config-as-code.</w:t>
       </w:r>
     </w:p>
     <w:p>
@@ -423,7 +492,7 @@
           <w:numId w:val="1"/>
         </w:numPr>
         <w:shd w:val="clear" w:fill="auto"/>
-        <w:spacing w:lineRule="exact" w:line="283" w:before="0" w:after="0"/>
+        <w:spacing w:lineRule="exact" w:line="283" w:before="0" w:after="40"/>
         <w:ind w:hanging="360" w:start="288" w:end="0"/>
         <w:contextualSpacing/>
         <w:jc w:val="start"/>
@@ -448,29 +517,27 @@
           <w:shd w:fill="auto" w:val="clear"/>
           <w:vertAlign w:val="baseline"/>
         </w:rPr>
-        <w:t xml:space="preserve">Implemented security controls including </w:t>
+        <w:t>Enforced zero-trust security posture: GuardDuty threat detection, IAM Access Analyzer, Inspector vulnerability scanning, SG/NACL micro-segmentation, and AWS Config drift detection.</w:t>
       </w:r>
-      <w:r>
-        <w:rPr>
-          <w:rFonts w:eastAsia="Calibri" w:cs="Calibri"/>
-          <w:b/>
-          <w:bCs/>
-          <w:i w:val="false"/>
-          <w:iCs w:val="false"/>
-          <w:caps w:val="false"/>
-          <w:smallCaps w:val="false"/>
-          <w:strike w:val="false"/>
-          <w:dstrike w:val="false"/>
-          <w:color w:val="000000"/>
-          <w:position w:val="0"/>
-          <w:sz w:val="21"/>
-          <w:szCs w:val="20"/>
-          <w:u w:val="none"/>
-          <w:shd w:fill="auto" w:val="clear"/>
-          <w:vertAlign w:val="baseline"/>
-        </w:rPr>
-        <w:t>GuardDuty</w:t>
-      </w:r>
+    </w:p>
+    <w:p>
+      <w:pPr>
+        <w:pStyle w:val="normal1"/>
+        <w:keepNext w:val="false"/>
+        <w:keepLines w:val="false"/>
+        <w:pageBreakBefore w:val="false"/>
+        <w:widowControl/>
+        <w:numPr>
+          <w:ilvl w:val="0"/>
+          <w:numId w:val="1"/>
+        </w:numPr>
+        <w:shd w:val="clear" w:fill="auto"/>
+        <w:spacing w:lineRule="exact" w:line="283" w:before="0" w:after="40"/>
+        <w:ind w:hanging="360" w:start="288" w:end="0"/>
+        <w:contextualSpacing/>
+        <w:jc w:val="start"/>
+        <w:rPr/>
+      </w:pPr>
       <w:r>
         <w:rPr>
           <w:rFonts w:eastAsia="Calibri" w:cs="Calibri"/>
@@ -490,29 +557,27 @@
           <w:shd w:fill="auto" w:val="clear"/>
           <w:vertAlign w:val="baseline"/>
         </w:rPr>
-        <w:t xml:space="preserve">, </w:t>
+        <w:t>Ranked 1st at The5ers Hackathon (July 2025) - strategy design and live execution on AWS infrastructure.</w:t>
       </w:r>
-      <w:r>
-        <w:rPr>
-          <w:rFonts w:eastAsia="Calibri" w:cs="Calibri"/>
-          <w:b/>
-          <w:bCs/>
-          <w:i w:val="false"/>
-          <w:iCs w:val="false"/>
-          <w:caps w:val="false"/>
-          <w:smallCaps w:val="false"/>
-          <w:strike w:val="false"/>
-          <w:dstrike w:val="false"/>
-          <w:color w:val="000000"/>
-          <w:position w:val="0"/>
-          <w:sz w:val="21"/>
-          <w:szCs w:val="20"/>
-          <w:u w:val="none"/>
-          <w:shd w:fill="auto" w:val="clear"/>
-          <w:vertAlign w:val="baseline"/>
-        </w:rPr>
-        <w:t>AWS Config</w:t>
-      </w:r>
+    </w:p>
+    <w:p>
+      <w:pPr>
+        <w:pStyle w:val="normal1"/>
+        <w:keepNext w:val="false"/>
+        <w:keepLines w:val="false"/>
+        <w:pageBreakBefore w:val="false"/>
+        <w:widowControl/>
+        <w:numPr>
+          <w:ilvl w:val="0"/>
+          <w:numId w:val="1"/>
+        </w:numPr>
+        <w:shd w:val="clear" w:fill="auto"/>
+        <w:spacing w:lineRule="exact" w:line="283" w:before="0" w:after="40"/>
+        <w:ind w:hanging="360" w:start="288" w:end="0"/>
+        <w:contextualSpacing/>
+        <w:jc w:val="start"/>
+        <w:rPr/>
+      </w:pPr>
       <w:r>
         <w:rPr>
           <w:rFonts w:eastAsia="Calibri" w:cs="Calibri"/>
@@ -532,592 +597,17 @@
           <w:shd w:fill="auto" w:val="clear"/>
           <w:vertAlign w:val="baseline"/>
         </w:rPr>
-        <w:t xml:space="preserve">, </w:t>
-      </w:r>
-      <w:r>
-        <w:rPr>
-          <w:rFonts w:eastAsia="Calibri" w:cs="Calibri"/>
-          <w:b/>
-          <w:bCs/>
-          <w:i w:val="false"/>
-          <w:iCs w:val="false"/>
-          <w:caps w:val="false"/>
-          <w:smallCaps w:val="false"/>
-          <w:strike w:val="false"/>
-          <w:dstrike w:val="false"/>
-          <w:color w:val="000000"/>
-          <w:position w:val="0"/>
-          <w:sz w:val="21"/>
-          <w:szCs w:val="20"/>
-          <w:u w:val="none"/>
-          <w:shd w:fill="auto" w:val="clear"/>
-          <w:vertAlign w:val="baseline"/>
-        </w:rPr>
-        <w:t>Inspector</w:t>
-      </w:r>
-      <w:r>
-        <w:rPr>
-          <w:rFonts w:eastAsia="Calibri" w:cs="Calibri"/>
-          <w:b w:val="false"/>
-          <w:bCs w:val="false"/>
-          <w:i w:val="false"/>
-          <w:iCs w:val="false"/>
-          <w:caps w:val="false"/>
-          <w:smallCaps w:val="false"/>
-          <w:strike w:val="false"/>
-          <w:dstrike w:val="false"/>
-          <w:color w:val="000000"/>
-          <w:position w:val="0"/>
-          <w:sz w:val="21"/>
-          <w:szCs w:val="20"/>
-          <w:u w:val="none"/>
-          <w:shd w:fill="auto" w:val="clear"/>
-          <w:vertAlign w:val="baseline"/>
-        </w:rPr>
-        <w:t xml:space="preserve">, </w:t>
-      </w:r>
-      <w:r>
-        <w:rPr>
-          <w:rFonts w:eastAsia="Calibri" w:cs="Calibri"/>
-          <w:b/>
-          <w:bCs/>
-          <w:i w:val="false"/>
-          <w:iCs w:val="false"/>
-          <w:caps w:val="false"/>
-          <w:smallCaps w:val="false"/>
-          <w:strike w:val="false"/>
-          <w:dstrike w:val="false"/>
-          <w:color w:val="000000"/>
-          <w:position w:val="0"/>
-          <w:sz w:val="21"/>
-          <w:szCs w:val="20"/>
-          <w:u w:val="none"/>
-          <w:shd w:fill="auto" w:val="clear"/>
-          <w:vertAlign w:val="baseline"/>
-        </w:rPr>
-        <w:t>IAM Access Analyzer</w:t>
-      </w:r>
-      <w:r>
-        <w:rPr>
-          <w:rFonts w:eastAsia="Calibri" w:cs="Calibri"/>
-          <w:b w:val="false"/>
-          <w:bCs w:val="false"/>
-          <w:i w:val="false"/>
-          <w:iCs w:val="false"/>
-          <w:caps w:val="false"/>
-          <w:smallCaps w:val="false"/>
-          <w:strike w:val="false"/>
-          <w:dstrike w:val="false"/>
-          <w:color w:val="000000"/>
-          <w:position w:val="0"/>
-          <w:sz w:val="21"/>
-          <w:szCs w:val="20"/>
-          <w:u w:val="none"/>
-          <w:shd w:fill="auto" w:val="clear"/>
-          <w:vertAlign w:val="baseline"/>
-        </w:rPr>
-        <w:t>, SG/NACL segmentation.</w:t>
+        <w:t>Provisioned all cloud infrastructure with Terraform (VPC, EKS, IAM, RDS, S3) - enabling reproducible environments and eliminating configuration drift across deployments.</w:t>
       </w:r>
     </w:p>
     <w:p>
       <w:pPr>
         <w:pStyle w:val="normal1"/>
-        <w:keepNext w:val="false"/>
-        <w:keepLines w:val="false"/>
-        <w:pageBreakBefore w:val="false"/>
-        <w:widowControl/>
-        <w:numPr>
-          <w:ilvl w:val="0"/>
-          <w:numId w:val="1"/>
-        </w:numPr>
-        <w:shd w:val="clear" w:fill="auto"/>
-        <w:spacing w:lineRule="exact" w:line="283" w:before="0" w:after="0"/>
-        <w:ind w:hanging="360" w:start="288" w:end="0"/>
-        <w:contextualSpacing/>
-        <w:jc w:val="start"/>
-        <w:rPr/>
-      </w:pPr>
-      <w:r>
-        <w:rPr>
-          <w:rFonts w:eastAsia="Calibri" w:cs="Calibri"/>
-          <w:b w:val="false"/>
-          <w:bCs w:val="false"/>
-          <w:i w:val="false"/>
-          <w:iCs w:val="false"/>
-          <w:caps w:val="false"/>
-          <w:smallCaps w:val="false"/>
-          <w:strike w:val="false"/>
-          <w:dstrike w:val="false"/>
-          <w:color w:val="000000"/>
-          <w:position w:val="0"/>
-          <w:sz w:val="21"/>
-          <w:szCs w:val="20"/>
-          <w:u w:val="none"/>
-          <w:shd w:fill="auto" w:val="clear"/>
-          <w:vertAlign w:val="baseline"/>
-        </w:rPr>
-        <w:t xml:space="preserve">Operated </w:t>
-      </w:r>
-      <w:r>
-        <w:rPr>
-          <w:rFonts w:eastAsia="Calibri" w:cs="Calibri"/>
-          <w:b/>
-          <w:bCs/>
-          <w:i w:val="false"/>
-          <w:iCs w:val="false"/>
-          <w:caps w:val="false"/>
-          <w:smallCaps w:val="false"/>
-          <w:strike w:val="false"/>
-          <w:dstrike w:val="false"/>
-          <w:color w:val="000000"/>
-          <w:position w:val="0"/>
-          <w:sz w:val="21"/>
-          <w:szCs w:val="20"/>
-          <w:u w:val="none"/>
-          <w:shd w:fill="auto" w:val="clear"/>
-          <w:vertAlign w:val="baseline"/>
-        </w:rPr>
-        <w:t>EKS</w:t>
-      </w:r>
-      <w:r>
-        <w:rPr>
-          <w:rFonts w:eastAsia="Calibri" w:cs="Calibri"/>
-          <w:b w:val="false"/>
-          <w:bCs w:val="false"/>
-          <w:i w:val="false"/>
-          <w:iCs w:val="false"/>
-          <w:caps w:val="false"/>
-          <w:smallCaps w:val="false"/>
-          <w:strike w:val="false"/>
-          <w:dstrike w:val="false"/>
-          <w:color w:val="000000"/>
-          <w:position w:val="0"/>
-          <w:sz w:val="21"/>
-          <w:szCs w:val="20"/>
-          <w:u w:val="none"/>
-          <w:shd w:fill="auto" w:val="clear"/>
-          <w:vertAlign w:val="baseline"/>
-        </w:rPr>
-        <w:t xml:space="preserve"> clusters with RBAC, Pod Security, NetworkPolicies, and workload isolation.</w:t>
-      </w:r>
-    </w:p>
-    <w:p>
-      <w:pPr>
-        <w:pStyle w:val="normal1"/>
-        <w:keepNext w:val="false"/>
-        <w:keepLines w:val="false"/>
-        <w:pageBreakBefore w:val="false"/>
-        <w:widowControl/>
-        <w:numPr>
-          <w:ilvl w:val="0"/>
-          <w:numId w:val="1"/>
-        </w:numPr>
-        <w:shd w:val="clear" w:fill="auto"/>
-        <w:spacing w:lineRule="exact" w:line="283" w:before="0" w:after="0"/>
-        <w:ind w:hanging="360" w:start="288" w:end="0"/>
-        <w:contextualSpacing/>
-        <w:jc w:val="start"/>
-        <w:rPr/>
-      </w:pPr>
-      <w:r>
-        <w:rPr>
-          <w:rFonts w:eastAsia="Calibri" w:cs="Calibri"/>
-          <w:b w:val="false"/>
-          <w:bCs w:val="false"/>
-          <w:i w:val="false"/>
-          <w:iCs w:val="false"/>
-          <w:caps w:val="false"/>
-          <w:smallCaps w:val="false"/>
-          <w:strike w:val="false"/>
-          <w:dstrike w:val="false"/>
-          <w:color w:val="000000"/>
-          <w:position w:val="0"/>
-          <w:sz w:val="21"/>
-          <w:szCs w:val="20"/>
-          <w:u w:val="none"/>
-          <w:shd w:fill="auto" w:val="clear"/>
-          <w:vertAlign w:val="baseline"/>
-        </w:rPr>
-        <w:t xml:space="preserve">Built </w:t>
-      </w:r>
-      <w:r>
-        <w:rPr>
-          <w:rFonts w:eastAsia="Calibri" w:cs="Calibri"/>
-          <w:b/>
-          <w:bCs/>
-          <w:i w:val="false"/>
-          <w:iCs w:val="false"/>
-          <w:caps w:val="false"/>
-          <w:smallCaps w:val="false"/>
-          <w:strike w:val="false"/>
-          <w:dstrike w:val="false"/>
-          <w:color w:val="000000"/>
-          <w:position w:val="0"/>
-          <w:sz w:val="21"/>
-          <w:szCs w:val="20"/>
-          <w:u w:val="none"/>
-          <w:shd w:fill="auto" w:val="clear"/>
-          <w:vertAlign w:val="baseline"/>
-        </w:rPr>
-        <w:t>CI/CD pipelines</w:t>
-      </w:r>
-      <w:r>
-        <w:rPr>
-          <w:rFonts w:eastAsia="Calibri" w:cs="Calibri"/>
-          <w:b w:val="false"/>
-          <w:bCs w:val="false"/>
-          <w:i w:val="false"/>
-          <w:iCs w:val="false"/>
-          <w:caps w:val="false"/>
-          <w:smallCaps w:val="false"/>
-          <w:strike w:val="false"/>
-          <w:dstrike w:val="false"/>
-          <w:color w:val="000000"/>
-          <w:position w:val="0"/>
-          <w:sz w:val="21"/>
-          <w:szCs w:val="20"/>
-          <w:u w:val="none"/>
-          <w:shd w:fill="auto" w:val="clear"/>
-          <w:vertAlign w:val="baseline"/>
-        </w:rPr>
-        <w:t xml:space="preserve"> using Jenkins and </w:t>
-      </w:r>
-      <w:r>
-        <w:rPr>
-          <w:rFonts w:eastAsia="Calibri" w:cs="Calibri"/>
-          <w:b/>
-          <w:bCs/>
-          <w:i w:val="false"/>
-          <w:iCs w:val="false"/>
-          <w:caps w:val="false"/>
-          <w:smallCaps w:val="false"/>
-          <w:strike w:val="false"/>
-          <w:dstrike w:val="false"/>
-          <w:color w:val="000000"/>
-          <w:position w:val="0"/>
-          <w:sz w:val="21"/>
-          <w:szCs w:val="20"/>
-          <w:u w:val="none"/>
-          <w:shd w:fill="auto" w:val="clear"/>
-          <w:vertAlign w:val="baseline"/>
-        </w:rPr>
-        <w:t>AWS CodePipeline</w:t>
-      </w:r>
-      <w:r>
-        <w:rPr>
-          <w:rFonts w:eastAsia="Calibri" w:cs="Calibri"/>
-          <w:b w:val="false"/>
-          <w:bCs w:val="false"/>
-          <w:i w:val="false"/>
-          <w:iCs w:val="false"/>
-          <w:caps w:val="false"/>
-          <w:smallCaps w:val="false"/>
-          <w:strike w:val="false"/>
-          <w:dstrike w:val="false"/>
-          <w:color w:val="000000"/>
-          <w:position w:val="0"/>
-          <w:sz w:val="21"/>
-          <w:szCs w:val="20"/>
-          <w:u w:val="none"/>
-          <w:shd w:fill="auto" w:val="clear"/>
-          <w:vertAlign w:val="baseline"/>
-        </w:rPr>
-        <w:t xml:space="preserve"> for automated testing and deployments.</w:t>
-      </w:r>
-    </w:p>
-    <w:p>
-      <w:pPr>
-        <w:pStyle w:val="normal1"/>
-        <w:keepNext w:val="false"/>
-        <w:keepLines w:val="false"/>
-        <w:pageBreakBefore w:val="false"/>
-        <w:widowControl/>
-        <w:numPr>
-          <w:ilvl w:val="0"/>
-          <w:numId w:val="1"/>
-        </w:numPr>
-        <w:shd w:val="clear" w:fill="auto"/>
-        <w:spacing w:lineRule="exact" w:line="283" w:before="0" w:after="0"/>
-        <w:ind w:hanging="360" w:start="288" w:end="0"/>
-        <w:contextualSpacing/>
-        <w:jc w:val="start"/>
-        <w:rPr/>
-      </w:pPr>
-      <w:r>
-        <w:rPr>
-          <w:rFonts w:eastAsia="Calibri" w:cs="Calibri"/>
-          <w:b w:val="false"/>
-          <w:bCs w:val="false"/>
-          <w:i w:val="false"/>
-          <w:iCs w:val="false"/>
-          <w:caps w:val="false"/>
-          <w:smallCaps w:val="false"/>
-          <w:strike w:val="false"/>
-          <w:dstrike w:val="false"/>
-          <w:color w:val="000000"/>
-          <w:position w:val="0"/>
-          <w:sz w:val="21"/>
-          <w:szCs w:val="20"/>
-          <w:u w:val="none"/>
-          <w:shd w:fill="auto" w:val="clear"/>
-          <w:vertAlign w:val="baseline"/>
-        </w:rPr>
-        <w:t xml:space="preserve">Implemented RAG pipelines using </w:t>
-      </w:r>
-      <w:r>
-        <w:rPr>
-          <w:rFonts w:eastAsia="Calibri" w:cs="Calibri"/>
-          <w:b/>
-          <w:bCs/>
-          <w:i w:val="false"/>
-          <w:iCs w:val="false"/>
-          <w:caps w:val="false"/>
-          <w:smallCaps w:val="false"/>
-          <w:strike w:val="false"/>
-          <w:dstrike w:val="false"/>
-          <w:color w:val="000000"/>
-          <w:position w:val="0"/>
-          <w:sz w:val="21"/>
-          <w:szCs w:val="20"/>
-          <w:u w:val="none"/>
-          <w:shd w:fill="auto" w:val="clear"/>
-          <w:vertAlign w:val="baseline"/>
-        </w:rPr>
-        <w:t>AWS Bedrock</w:t>
-      </w:r>
-      <w:r>
-        <w:rPr>
-          <w:rFonts w:eastAsia="Calibri" w:cs="Calibri"/>
-          <w:b w:val="false"/>
-          <w:bCs w:val="false"/>
-          <w:i w:val="false"/>
-          <w:iCs w:val="false"/>
-          <w:caps w:val="false"/>
-          <w:smallCaps w:val="false"/>
-          <w:strike w:val="false"/>
-          <w:dstrike w:val="false"/>
-          <w:color w:val="000000"/>
-          <w:position w:val="0"/>
-          <w:sz w:val="21"/>
-          <w:szCs w:val="20"/>
-          <w:u w:val="none"/>
-          <w:shd w:fill="auto" w:val="clear"/>
-          <w:vertAlign w:val="baseline"/>
-        </w:rPr>
-        <w:t>, embeddings, and vector search.</w:t>
-      </w:r>
-    </w:p>
-    <w:p>
-      <w:pPr>
-        <w:pStyle w:val="normal1"/>
         <w:spacing w:lineRule="auto" w:line="240" w:before="0" w:after="40"/>
         <w:rPr/>
       </w:pPr>
       <w:r>
         <w:rPr/>
-      </w:r>
-    </w:p>
-    <w:p>
-      <w:pPr>
-        <w:pStyle w:val="normal1"/>
-        <w:spacing w:lineRule="auto" w:line="240" w:before="0" w:after="40"/>
-        <w:rPr/>
-      </w:pPr>
-      <w:r>
-        <w:rPr>
-          <w:rFonts w:eastAsia="Calibri" w:cs="Calibri"/>
-          <w:b/>
-          <w:bCs/>
-          <w:sz w:val="21"/>
-          <w:szCs w:val="21"/>
-        </w:rPr>
-        <w:t>Algorithmic Trader / Quantitative Researcher (Freelance)</w:t>
-      </w:r>
-    </w:p>
-    <w:p>
-      <w:pPr>
-        <w:pStyle w:val="normal1"/>
-        <w:spacing w:lineRule="auto" w:line="240" w:before="0" w:after="40"/>
-        <w:rPr/>
-      </w:pPr>
-      <w:r>
-        <w:rPr>
-          <w:rFonts w:eastAsia="Calibri" w:cs="Calibri"/>
-          <w:sz w:val="21"/>
-          <w:szCs w:val="21"/>
-        </w:rPr>
-        <w:t>Self-Employed | Remote</w:t>
-      </w:r>
-    </w:p>
-    <w:p>
-      <w:pPr>
-        <w:pStyle w:val="normal1"/>
-        <w:spacing w:lineRule="auto" w:line="240" w:before="0" w:after="40"/>
-        <w:rPr/>
-      </w:pPr>
-      <w:r>
-        <w:rPr>
-          <w:rFonts w:eastAsia="Calibri" w:cs="Calibri"/>
-          <w:i/>
-          <w:iCs/>
-          <w:sz w:val="21"/>
-          <w:szCs w:val="21"/>
-        </w:rPr>
-        <w:t>Jan 2022 - Present</w:t>
-      </w:r>
-    </w:p>
-    <w:p>
-      <w:pPr>
-        <w:pStyle w:val="normal1"/>
-        <w:keepNext w:val="false"/>
-        <w:keepLines w:val="false"/>
-        <w:pageBreakBefore w:val="false"/>
-        <w:numPr>
-          <w:ilvl w:val="0"/>
-          <w:numId w:val="1"/>
-        </w:numPr>
-        <w:shd w:val="clear" w:fill="auto"/>
-        <w:spacing w:lineRule="exact" w:line="283" w:before="0" w:after="0"/>
-        <w:ind w:hanging="360" w:start="288" w:end="0"/>
-        <w:contextualSpacing/>
-        <w:rPr>
-          <w:rFonts w:eastAsia="Calibri" w:cs="Calibri"/>
-          <w:color w:val="000000"/>
-          <w:sz w:val="21"/>
-          <w:szCs w:val="20"/>
-        </w:rPr>
-      </w:pPr>
-      <w:r>
-        <w:rPr>
-          <w:rFonts w:eastAsia="Calibri" w:cs="Calibri"/>
-          <w:color w:val="000000"/>
-          <w:sz w:val="21"/>
-          <w:szCs w:val="20"/>
-        </w:rPr>
-        <w:t>Designed and operated automated trading systems on AWS (EC2, Lambda, S3) using Python.</w:t>
-      </w:r>
-    </w:p>
-    <w:p>
-      <w:pPr>
-        <w:pStyle w:val="normal1"/>
-        <w:keepNext w:val="false"/>
-        <w:keepLines w:val="false"/>
-        <w:pageBreakBefore w:val="false"/>
-        <w:numPr>
-          <w:ilvl w:val="0"/>
-          <w:numId w:val="1"/>
-        </w:numPr>
-        <w:shd w:val="clear" w:fill="auto"/>
-        <w:spacing w:lineRule="exact" w:line="283" w:before="0" w:after="0"/>
-        <w:ind w:hanging="360" w:start="288" w:end="0"/>
-        <w:contextualSpacing/>
-        <w:rPr>
-          <w:rFonts w:eastAsia="Calibri" w:cs="Calibri"/>
-          <w:color w:val="000000"/>
-          <w:sz w:val="21"/>
-          <w:szCs w:val="20"/>
-        </w:rPr>
-      </w:pPr>
-      <w:r>
-        <w:rPr>
-          <w:rFonts w:eastAsia="Calibri" w:cs="Calibri"/>
-          <w:color w:val="000000"/>
-          <w:sz w:val="21"/>
-          <w:szCs w:val="20"/>
-        </w:rPr>
-        <w:t>Built data ingestion pipelines using WebSocket APIs for real-time market data collection and analysis.</w:t>
-      </w:r>
-    </w:p>
-    <w:p>
-      <w:pPr>
-        <w:pStyle w:val="normal1"/>
-        <w:keepNext w:val="false"/>
-        <w:keepLines w:val="false"/>
-        <w:pageBreakBefore w:val="false"/>
-        <w:numPr>
-          <w:ilvl w:val="0"/>
-          <w:numId w:val="1"/>
-        </w:numPr>
-        <w:shd w:val="clear" w:fill="auto"/>
-        <w:spacing w:lineRule="exact" w:line="283" w:before="0" w:after="0"/>
-        <w:ind w:hanging="360" w:start="288" w:end="0"/>
-        <w:contextualSpacing/>
-        <w:rPr>
-          <w:rFonts w:eastAsia="Calibri" w:cs="Calibri"/>
-          <w:color w:val="000000"/>
-          <w:sz w:val="21"/>
-          <w:szCs w:val="20"/>
-        </w:rPr>
-      </w:pPr>
-      <w:r>
-        <w:rPr>
-          <w:rFonts w:eastAsia="Calibri" w:cs="Calibri"/>
-          <w:color w:val="000000"/>
-          <w:sz w:val="21"/>
-          <w:szCs w:val="20"/>
-        </w:rPr>
-        <w:t>Implemented automated risk frameworks including drawdown constraints and position monitoring.</w:t>
-      </w:r>
-    </w:p>
-    <w:p>
-      <w:pPr>
-        <w:pStyle w:val="normal1"/>
-        <w:keepNext w:val="false"/>
-        <w:keepLines w:val="false"/>
-        <w:pageBreakBefore w:val="false"/>
-        <w:numPr>
-          <w:ilvl w:val="0"/>
-          <w:numId w:val="1"/>
-        </w:numPr>
-        <w:shd w:val="clear" w:fill="auto"/>
-        <w:spacing w:lineRule="exact" w:line="283" w:before="0" w:after="0"/>
-        <w:ind w:hanging="360" w:start="288" w:end="0"/>
-        <w:contextualSpacing/>
-        <w:rPr>
-          <w:rFonts w:eastAsia="Calibri" w:cs="Calibri"/>
-          <w:color w:val="000000"/>
-          <w:sz w:val="21"/>
-          <w:szCs w:val="20"/>
-        </w:rPr>
-      </w:pPr>
-      <w:r>
-        <w:rPr>
-          <w:rFonts w:eastAsia="Calibri" w:cs="Calibri"/>
-          <w:color w:val="000000"/>
-          <w:sz w:val="21"/>
-          <w:szCs w:val="20"/>
-        </w:rPr>
-        <w:t>1st place at The5ers Hackathon (July 2025) for strategy design and execution.</w:t>
-      </w:r>
-    </w:p>
-    <w:p>
-      <w:pPr>
-        <w:pStyle w:val="normal1"/>
-        <w:keepNext w:val="false"/>
-        <w:keepLines w:val="false"/>
-        <w:pageBreakBefore w:val="false"/>
-        <w:numPr>
-          <w:ilvl w:val="0"/>
-          <w:numId w:val="0"/>
-        </w:numPr>
-        <w:shd w:val="clear" w:fill="auto"/>
-        <w:spacing w:lineRule="exact" w:line="283" w:before="0" w:after="0"/>
-        <w:ind w:hanging="0" w:start="-72" w:end="0"/>
-        <w:contextualSpacing/>
-        <w:rPr>
-          <w:rFonts w:eastAsia="Calibri" w:cs="Calibri"/>
-          <w:color w:val="000000"/>
-          <w:sz w:val="21"/>
-          <w:szCs w:val="20"/>
-        </w:rPr>
-      </w:pPr>
-      <w:r>
-        <w:rPr>
-          <w:rFonts w:eastAsia="Calibri" w:cs="Calibri"/>
-          <w:color w:val="000000"/>
-          <w:sz w:val="21"/>
-          <w:szCs w:val="20"/>
-        </w:rPr>
       </w:r>
     </w:p>
     <w:p>
@@ -1180,7 +670,7 @@
           <w:numId w:val="1"/>
         </w:numPr>
         <w:shd w:val="clear" w:fill="auto"/>
-        <w:spacing w:lineRule="exact" w:line="283" w:before="0" w:after="0"/>
+        <w:spacing w:lineRule="exact" w:line="283" w:before="0" w:after="40"/>
         <w:ind w:hanging="360" w:start="288" w:end="0"/>
         <w:contextualSpacing/>
         <w:rPr>
@@ -1191,13 +681,7 @@
         </w:rPr>
       </w:pPr>
       <w:r>
-        <w:rPr>
-          <w:rFonts w:eastAsia="Calibri" w:cs="Calibri"/>
-          <w:color w:val="000000"/>
-          <w:sz w:val="21"/>
-          <w:szCs w:val="20"/>
-        </w:rPr>
-        <w:t>Refactored Django backends and JavaScript frontends, improving performance.</w:t>
+        <w:t>Refactored Django/JS stack at Fiserv, cutting page load times by 40-60%, PostgreSQL CPU usage by ~30%, and API response times to under 200ms.</w:t>
       </w:r>
     </w:p>
     <w:p>
@@ -1211,7 +695,7 @@
           <w:numId w:val="1"/>
         </w:numPr>
         <w:shd w:val="clear" w:fill="auto"/>
-        <w:spacing w:lineRule="exact" w:line="283" w:before="0" w:after="0"/>
+        <w:spacing w:lineRule="exact" w:line="283" w:before="0" w:after="40"/>
         <w:ind w:hanging="360" w:start="288" w:end="0"/>
         <w:contextualSpacing/>
         <w:rPr>
@@ -1222,44 +706,7 @@
         </w:rPr>
       </w:pPr>
       <w:r>
-        <w:rPr>
-          <w:rFonts w:eastAsia="Calibri" w:cs="Calibri"/>
-          <w:color w:val="000000"/>
-          <w:sz w:val="21"/>
-          <w:szCs w:val="20"/>
-        </w:rPr>
-        <w:t>Reduced page load times by 40-60%, PostgreSQL CPU usage by ~30%, API response times to below 200 ms.</w:t>
-      </w:r>
-    </w:p>
-    <w:p>
-      <w:pPr>
-        <w:pStyle w:val="normal1"/>
-        <w:keepNext w:val="false"/>
-        <w:keepLines w:val="false"/>
-        <w:pageBreakBefore w:val="false"/>
-        <w:numPr>
-          <w:ilvl w:val="0"/>
-          <w:numId w:val="1"/>
-        </w:numPr>
-        <w:shd w:val="clear" w:fill="auto"/>
-        <w:spacing w:lineRule="exact" w:line="283" w:before="0" w:after="0"/>
-        <w:ind w:hanging="360" w:start="288" w:end="0"/>
-        <w:contextualSpacing/>
-        <w:rPr>
-          <w:rFonts w:eastAsia="Calibri" w:cs="Calibri"/>
-          <w:color w:val="000000"/>
-          <w:sz w:val="21"/>
-          <w:szCs w:val="20"/>
-        </w:rPr>
-      </w:pPr>
-      <w:r>
-        <w:rPr>
-          <w:rFonts w:eastAsia="Calibri" w:cs="Calibri"/>
-          <w:color w:val="000000"/>
-          <w:sz w:val="21"/>
-          <w:szCs w:val="20"/>
-        </w:rPr>
-        <w:t>Converted tribal knowledge into structured documentation.</w:t>
+        <w:t>Automated network infrastructure deployments with Ansible playbooks, cutting per-site rollout time from weeks to hours and eliminating manual configuration errors.</w:t>
       </w:r>
     </w:p>
     <w:p>
@@ -1273,7 +720,7 @@
           <w:numId w:val="0"/>
         </w:numPr>
         <w:shd w:val="clear" w:fill="auto"/>
-        <w:spacing w:lineRule="exact" w:line="283" w:before="0" w:after="0"/>
+        <w:spacing w:lineRule="exact" w:line="283" w:before="0" w:after="40"/>
         <w:ind w:hanging="0" w:start="288" w:end="0"/>
         <w:contextualSpacing/>
         <w:rPr>
@@ -1352,7 +799,7 @@
           <w:numId w:val="1"/>
         </w:numPr>
         <w:shd w:val="clear" w:fill="auto"/>
-        <w:spacing w:lineRule="exact" w:line="283" w:before="0" w:after="0"/>
+        <w:spacing w:lineRule="exact" w:line="283" w:before="0" w:after="40"/>
         <w:ind w:hanging="360" w:start="288" w:end="0"/>
         <w:contextualSpacing/>
         <w:rPr>
@@ -1363,13 +810,7 @@
         </w:rPr>
       </w:pPr>
       <w:r>
-        <w:rPr>
-          <w:rFonts w:eastAsia="Calibri" w:cs="Calibri"/>
-          <w:color w:val="000000"/>
-          <w:sz w:val="21"/>
-          <w:szCs w:val="20"/>
-        </w:rPr>
-        <w:t>Built automation and internal tooling for Amazon's global datacenter network, reducing manual operations.</w:t>
+        <w:t>Engineered internal self-service tooling (React + Python) adopted by Amazon's global datacenter network teams - eliminating hours of manual operations per week per deployment cycle.</w:t>
       </w:r>
     </w:p>
     <w:p>
@@ -1383,7 +824,7 @@
           <w:numId w:val="1"/>
         </w:numPr>
         <w:shd w:val="clear" w:fill="auto"/>
-        <w:spacing w:lineRule="exact" w:line="283" w:before="0" w:after="0"/>
+        <w:spacing w:lineRule="exact" w:line="283" w:before="0" w:after="40"/>
         <w:ind w:hanging="360" w:start="288" w:end="0"/>
         <w:contextualSpacing/>
         <w:rPr>
@@ -1394,13 +835,7 @@
         </w:rPr>
       </w:pPr>
       <w:r>
-        <w:rPr>
-          <w:rFonts w:eastAsia="Calibri" w:cs="Calibri"/>
-          <w:color w:val="000000"/>
-          <w:sz w:val="21"/>
-          <w:szCs w:val="20"/>
-        </w:rPr>
-        <w:t>Built a Load Balancer provisioning automation system with React frontend and Python backend.</w:t>
+        <w:t>Designed and delivered a zero-touch pre-provisioning platform (Python, EC2, S3) for L7 hardware - reducing per-rack deployment time from weeks to hours across thousands of devices.</w:t>
       </w:r>
     </w:p>
     <w:p>
@@ -1414,7 +849,7 @@
           <w:numId w:val="1"/>
         </w:numPr>
         <w:shd w:val="clear" w:fill="auto"/>
-        <w:spacing w:lineRule="exact" w:line="283" w:before="0" w:after="0"/>
+        <w:spacing w:lineRule="exact" w:line="283" w:before="0" w:after="40"/>
         <w:ind w:hanging="360" w:start="288" w:end="0"/>
         <w:contextualSpacing/>
         <w:rPr>
@@ -1425,75 +860,7 @@
         </w:rPr>
       </w:pPr>
       <w:r>
-        <w:rPr>
-          <w:rFonts w:eastAsia="Calibri" w:cs="Calibri"/>
-          <w:color w:val="000000"/>
-          <w:sz w:val="21"/>
-          <w:szCs w:val="20"/>
-        </w:rPr>
-        <w:t>Designed and delivered a zero-touch pre-provisioning platform (Python, EC2, S3) for L7 hardware deployments.</w:t>
-      </w:r>
-    </w:p>
-    <w:p>
-      <w:pPr>
-        <w:pStyle w:val="normal1"/>
-        <w:keepNext w:val="false"/>
-        <w:keepLines w:val="false"/>
-        <w:pageBreakBefore w:val="false"/>
-        <w:numPr>
-          <w:ilvl w:val="0"/>
-          <w:numId w:val="1"/>
-        </w:numPr>
-        <w:shd w:val="clear" w:fill="auto"/>
-        <w:spacing w:lineRule="exact" w:line="283" w:before="0" w:after="0"/>
-        <w:ind w:hanging="360" w:start="288" w:end="0"/>
-        <w:contextualSpacing/>
-        <w:rPr>
-          <w:rFonts w:eastAsia="Calibri" w:cs="Calibri"/>
-          <w:color w:val="000000"/>
-          <w:sz w:val="21"/>
-          <w:szCs w:val="20"/>
-        </w:rPr>
-      </w:pPr>
-      <w:r>
-        <w:rPr>
-          <w:rFonts w:eastAsia="Calibri" w:cs="Calibri"/>
-          <w:color w:val="000000"/>
-          <w:sz w:val="21"/>
-          <w:szCs w:val="20"/>
-        </w:rPr>
-        <w:t>Optimized internal dashboards by rewriting ingestion logic to multithreaded processing, increasing throughput by ~40%.</w:t>
-      </w:r>
-    </w:p>
-    <w:p>
-      <w:pPr>
-        <w:pStyle w:val="normal1"/>
-        <w:keepNext w:val="false"/>
-        <w:keepLines w:val="false"/>
-        <w:pageBreakBefore w:val="false"/>
-        <w:numPr>
-          <w:ilvl w:val="0"/>
-          <w:numId w:val="1"/>
-        </w:numPr>
-        <w:shd w:val="clear" w:fill="auto"/>
-        <w:spacing w:lineRule="exact" w:line="283" w:before="0" w:after="0"/>
-        <w:ind w:hanging="360" w:start="288" w:end="0"/>
-        <w:contextualSpacing/>
-        <w:rPr>
-          <w:rFonts w:eastAsia="Calibri" w:cs="Calibri"/>
-          <w:color w:val="000000"/>
-          <w:sz w:val="21"/>
-          <w:szCs w:val="20"/>
-        </w:rPr>
-      </w:pPr>
-      <w:r>
-        <w:rPr>
-          <w:rFonts w:eastAsia="Calibri" w:cs="Calibri"/>
-          <w:color w:val="000000"/>
-          <w:sz w:val="21"/>
-          <w:szCs w:val="20"/>
-        </w:rPr>
-        <w:t>Mentored junior engineers and collaborated with senior leadership on cross-team initiatives.</w:t>
+        <w:t>Optimized internal dashboards with multithreaded ingestion logic, increasing throughput by ~40%.</w:t>
       </w:r>
     </w:p>
     <w:p>
@@ -1507,7 +874,7 @@
           <w:numId w:val="0"/>
         </w:numPr>
         <w:shd w:val="clear" w:fill="auto"/>
-        <w:spacing w:lineRule="exact" w:line="283" w:before="0" w:after="0"/>
+        <w:spacing w:lineRule="exact" w:line="283" w:before="0" w:after="40"/>
         <w:ind w:hanging="0" w:start="288" w:end="0"/>
         <w:contextualSpacing/>
         <w:rPr>
@@ -1586,7 +953,7 @@
           <w:numId w:val="1"/>
         </w:numPr>
         <w:shd w:val="clear" w:fill="auto"/>
-        <w:spacing w:lineRule="exact" w:line="283" w:before="0" w:after="0"/>
+        <w:spacing w:lineRule="exact" w:line="283" w:before="0" w:after="40"/>
         <w:ind w:hanging="360" w:start="288" w:end="0"/>
         <w:contextualSpacing/>
         <w:rPr>
@@ -1597,13 +964,7 @@
         </w:rPr>
       </w:pPr>
       <w:r>
-        <w:rPr>
-          <w:rFonts w:eastAsia="Calibri" w:cs="Calibri"/>
-          <w:color w:val="000000"/>
-          <w:sz w:val="21"/>
-          <w:szCs w:val="20"/>
-        </w:rPr>
-        <w:t>Delivered projects under the Aggregation Scaling &amp; Deployment (ASD) program.</w:t>
+        <w:t>Scaled Amazon's global datacenter network under the Aggregation Scaling &amp; Deployment program, increasing capacity by ~30% via spine scaling templates across multiple regions.</w:t>
       </w:r>
     </w:p>
     <w:p>
@@ -1617,7 +978,7 @@
           <w:numId w:val="1"/>
         </w:numPr>
         <w:shd w:val="clear" w:fill="auto"/>
-        <w:spacing w:lineRule="exact" w:line="283" w:before="0" w:after="0"/>
+        <w:spacing w:lineRule="exact" w:line="283" w:before="0" w:after="40"/>
         <w:ind w:hanging="360" w:start="288" w:end="0"/>
         <w:contextualSpacing/>
         <w:rPr>
@@ -1628,13 +989,7 @@
         </w:rPr>
       </w:pPr>
       <w:r>
-        <w:rPr>
-          <w:rFonts w:eastAsia="Calibri" w:cs="Calibri"/>
-          <w:color w:val="000000"/>
-          <w:sz w:val="21"/>
-          <w:szCs w:val="20"/>
-        </w:rPr>
-        <w:t>Created deployment templates enabling spine scaling, increasing datacenter network capacity by ~30%.</w:t>
+        <w:t xml:space="preserve">Developed Python automation scripts and Jinja templates for network provisioning workflows - reducing pre-deployment manual steps and accelerating network readiness across global datacenters.</w:t>
       </w:r>
     </w:p>
     <w:p>
@@ -1648,7 +1003,7 @@
           <w:numId w:val="1"/>
         </w:numPr>
         <w:shd w:val="clear" w:fill="auto"/>
-        <w:spacing w:lineRule="exact" w:line="283" w:before="0" w:after="0"/>
+        <w:spacing w:lineRule="exact" w:line="283" w:before="0" w:after="40"/>
         <w:ind w:hanging="360" w:start="288" w:end="0"/>
         <w:contextualSpacing/>
         <w:rPr>
@@ -1659,13 +1014,7 @@
         </w:rPr>
       </w:pPr>
       <w:r>
-        <w:rPr>
-          <w:rFonts w:eastAsia="Calibri" w:cs="Calibri"/>
-          <w:color w:val="000000"/>
-          <w:sz w:val="21"/>
-          <w:szCs w:val="20"/>
-        </w:rPr>
-        <w:t>Executed multi-region deployments, improving consistency and availability.</w:t>
+        <w:t xml:space="preserve">Resolved bugs in global network automation systems with fleet-wide impact; contributed unit-tested improvements to shared internal Python libraries.</w:t>
       </w:r>
     </w:p>
     <w:p>
@@ -1679,7 +1028,7 @@
           <w:numId w:val="0"/>
         </w:numPr>
         <w:shd w:val="clear" w:fill="auto"/>
-        <w:spacing w:lineRule="exact" w:line="283" w:before="0" w:after="0"/>
+        <w:spacing w:lineRule="exact" w:line="283" w:before="0" w:after="40"/>
         <w:ind w:hanging="0" w:start="288" w:end="0"/>
         <w:contextualSpacing/>
         <w:rPr>
@@ -1758,7 +1107,7 @@
           <w:numId w:val="1"/>
         </w:numPr>
         <w:shd w:val="clear" w:fill="auto"/>
-        <w:spacing w:lineRule="exact" w:line="283" w:before="0" w:after="0"/>
+        <w:spacing w:lineRule="exact" w:line="283" w:before="0" w:after="40"/>
         <w:ind w:hanging="360" w:start="288" w:end="0"/>
         <w:contextualSpacing/>
         <w:rPr>
@@ -1769,13 +1118,7 @@
         </w:rPr>
       </w:pPr>
       <w:r>
-        <w:rPr>
-          <w:rFonts w:eastAsia="Calibri" w:cs="Calibri"/>
-          <w:color w:val="000000"/>
-          <w:sz w:val="21"/>
-          <w:szCs w:val="20"/>
-        </w:rPr>
-        <w:t>Led datacenter consolidation and Active Directory migrations across EU and UK sites, reducing authentication latency by 40%.</w:t>
+        <w:t>Led EU/UK datacenter consolidation and AD migrations, cutting authentication latency by 40%.</w:t>
       </w:r>
     </w:p>
     <w:p>
@@ -1789,7 +1132,7 @@
           <w:numId w:val="1"/>
         </w:numPr>
         <w:shd w:val="clear" w:fill="auto"/>
-        <w:spacing w:lineRule="exact" w:line="283" w:before="0" w:after="0"/>
+        <w:spacing w:lineRule="exact" w:line="283" w:before="0" w:after="40"/>
         <w:ind w:hanging="360" w:start="288" w:end="0"/>
         <w:contextualSpacing/>
         <w:rPr>
@@ -1800,13 +1143,7 @@
         </w:rPr>
       </w:pPr>
       <w:r>
-        <w:rPr>
-          <w:rFonts w:eastAsia="Calibri" w:cs="Calibri"/>
-          <w:color w:val="000000"/>
-          <w:sz w:val="21"/>
-          <w:szCs w:val="20"/>
-        </w:rPr>
-        <w:t>Delivered virtualization initiatives using VMware, reducing workstation provisioning time from 40 min to under 5 min.</w:t>
+        <w:t>Reduced workstation provisioning time from 40 min to under 5 min via VMware automation.</w:t>
       </w:r>
     </w:p>
     <w:p>
@@ -1820,7 +1157,7 @@
           <w:numId w:val="1"/>
         </w:numPr>
         <w:shd w:val="clear" w:fill="auto"/>
-        <w:spacing w:lineRule="exact" w:line="283" w:before="0" w:after="0"/>
+        <w:spacing w:lineRule="exact" w:line="283" w:before="0" w:after="40"/>
         <w:ind w:hanging="360" w:start="288" w:end="0"/>
         <w:contextualSpacing/>
         <w:rPr>
@@ -1831,44 +1168,7 @@
         </w:rPr>
       </w:pPr>
       <w:r>
-        <w:rPr>
-          <w:rFonts w:eastAsia="Calibri" w:cs="Calibri"/>
-          <w:color w:val="000000"/>
-          <w:sz w:val="21"/>
-          <w:szCs w:val="20"/>
-        </w:rPr>
-        <w:t>Executed network refresh projects, improving bandwidth efficiency by ~30%.</w:t>
-      </w:r>
-    </w:p>
-    <w:p>
-      <w:pPr>
-        <w:pStyle w:val="normal1"/>
-        <w:keepNext w:val="false"/>
-        <w:keepLines w:val="false"/>
-        <w:pageBreakBefore w:val="false"/>
-        <w:numPr>
-          <w:ilvl w:val="0"/>
-          <w:numId w:val="1"/>
-        </w:numPr>
-        <w:shd w:val="clear" w:fill="auto"/>
-        <w:spacing w:lineRule="exact" w:line="283" w:before="0" w:after="0"/>
-        <w:ind w:hanging="360" w:start="288" w:end="0"/>
-        <w:contextualSpacing/>
-        <w:rPr>
-          <w:rFonts w:eastAsia="Calibri" w:cs="Calibri"/>
-          <w:color w:val="000000"/>
-          <w:sz w:val="21"/>
-          <w:szCs w:val="20"/>
-        </w:rPr>
-      </w:pPr>
-      <w:r>
-        <w:rPr>
-          <w:rFonts w:eastAsia="Calibri" w:cs="Calibri"/>
-          <w:color w:val="000000"/>
-          <w:sz w:val="21"/>
-          <w:szCs w:val="20"/>
-        </w:rPr>
-        <w:t>Presented technical results to C-level executives; recognized through company Talent Program.</w:t>
+        <w:t>Automated Cisco provisioning and L2 security hardening across EU/UK sites: DHCP Snooping and Spanning Tree.</w:t>
       </w:r>
     </w:p>
     <w:p>
@@ -1882,7 +1182,7 @@
           <w:numId w:val="0"/>
         </w:numPr>
         <w:shd w:val="clear" w:fill="auto"/>
-        <w:spacing w:lineRule="exact" w:line="283" w:before="0" w:after="0"/>
+        <w:spacing w:lineRule="exact" w:line="283" w:before="0" w:after="40"/>
         <w:ind w:hanging="0" w:start="288" w:end="0"/>
         <w:contextualSpacing/>
         <w:rPr>
@@ -1961,7 +1261,7 @@
           <w:numId w:val="1"/>
         </w:numPr>
         <w:shd w:val="clear" w:fill="auto"/>
-        <w:spacing w:lineRule="exact" w:line="283" w:before="0" w:after="0"/>
+        <w:spacing w:lineRule="exact" w:line="283" w:before="0" w:after="40"/>
         <w:ind w:hanging="360" w:start="288" w:end="0"/>
         <w:contextualSpacing/>
         <w:rPr>
@@ -1972,13 +1272,7 @@
         </w:rPr>
       </w:pPr>
       <w:r>
-        <w:rPr>
-          <w:rFonts w:eastAsia="Calibri" w:cs="Calibri"/>
-          <w:color w:val="000000"/>
-          <w:sz w:val="21"/>
-          <w:szCs w:val="20"/>
-        </w:rPr>
-        <w:t>Implemented and optimized Trend Micro security solutions, IDS/IPS, and endpoint protection.</w:t>
+        <w:t>Implemented and tuned enterprise security stack (IDS/IPS, endpoint protection, incident response) across on-premises networks for SMB clients.</w:t>
       </w:r>
     </w:p>
     <w:p>
@@ -1992,7 +1286,7 @@
           <w:numId w:val="1"/>
         </w:numPr>
         <w:shd w:val="clear" w:fill="auto"/>
-        <w:spacing w:lineRule="exact" w:line="283" w:before="0" w:after="0"/>
+        <w:spacing w:lineRule="exact" w:line="283" w:before="0" w:after="40"/>
         <w:ind w:hanging="360" w:start="288" w:end="0"/>
         <w:contextualSpacing/>
         <w:rPr>
@@ -2003,13 +1297,27 @@
         </w:rPr>
       </w:pPr>
       <w:r>
+        <w:t xml:space="preserve">Advised clients on L2 network segmentation design and switch hardening - delivering new VLAN architectures, access control policies, and L2 security configurations across on-premises environments.</w:t>
+      </w:r>
+    </w:p>
+    <w:p>
+      <w:pPr>
+        <w:pStyle w:val="normal1"/>
+        <w:spacing w:lineRule="exact" w:line="283" w:before="0" w:after="40"/>
+      </w:pPr>
+    </w:p>
+    <w:p>
+      <w:pPr>
+        <w:pStyle w:val="normal1"/>
+        <w:spacing w:lineRule="auto" w:line="240" w:before="80" w:after="40"/>
+        <w:rPr/>
+      </w:pPr>
+      <w:r>
         <w:rPr>
-          <w:rFonts w:eastAsia="Calibri" w:cs="Calibri"/>
-          <w:color w:val="000000"/>
-          <w:sz w:val="21"/>
-          <w:szCs w:val="20"/>
+          <w:b/>
+          <w:sz w:val="23"/>
         </w:rPr>
-        <w:t>Managed incident response workflows and integrated security platforms within on-prem networks.</w:t>
+        <w:t>Projects (All on GitHub)</w:t>
       </w:r>
     </w:p>
     <w:p>
@@ -2023,7 +1331,7 @@
           <w:numId w:val="1"/>
         </w:numPr>
         <w:shd w:val="clear" w:fill="auto"/>
-        <w:spacing w:lineRule="exact" w:line="283" w:before="0" w:after="0"/>
+        <w:spacing w:lineRule="exact" w:line="283" w:before="0" w:after="40"/>
         <w:ind w:hanging="360" w:start="288" w:end="0"/>
         <w:contextualSpacing/>
         <w:rPr>
@@ -2034,33 +1342,7 @@
         </w:rPr>
       </w:pPr>
       <w:r>
-        <w:rPr>
-          <w:rFonts w:eastAsia="Calibri" w:cs="Calibri"/>
-          <w:color w:val="000000"/>
-          <w:sz w:val="21"/>
-          <w:szCs w:val="20"/>
-        </w:rPr>
-        <w:t>Supported security audits and compliance initiatives.</w:t>
-      </w:r>
-    </w:p>
-    <w:p>
-      <w:pPr>
-        <w:pStyle w:val="normal1"/>
-        <w:spacing w:lineRule="exact" w:line="283" w:before="0" w:after="0"/>
-      </w:pPr>
-    </w:p>
-    <w:p>
-      <w:pPr>
-        <w:pStyle w:val="normal1"/>
-        <w:spacing w:lineRule="auto" w:line="240" w:before="0" w:after="40"/>
-        <w:rPr/>
-      </w:pPr>
-      <w:r>
-        <w:rPr>
-          <w:b/>
-          <w:sz w:val="23"/>
-        </w:rPr>
-        <w:t>Projects (All on GitHub)</w:t>
+        <w:t>Atlas AI RAG - Financial Document Q&amp;A Platform on AWS</w:t>
       </w:r>
     </w:p>
     <w:p>
@@ -2074,7 +1356,7 @@
           <w:numId w:val="1"/>
         </w:numPr>
         <w:shd w:val="clear" w:fill="auto"/>
-        <w:spacing w:lineRule="exact" w:line="283" w:before="0" w:after="0"/>
+        <w:spacing w:lineRule="exact" w:line="283" w:before="0" w:after="40"/>
         <w:ind w:hanging="360" w:start="288" w:end="0"/>
         <w:contextualSpacing/>
         <w:rPr>
@@ -2084,14 +1366,12 @@
           <w:szCs w:val="20"/>
         </w:rPr>
       </w:pPr>
-      <w:hyperlink r:id="rId7">
-        <w:r>
-          <w:rPr>
-            <w:rStyle w:val="Hyperlink"/>
-          </w:rPr>
-          <w:t>Atlas AI RAG Financial Showcase: production-grade financial RAG platform with OpenAI and Anthropic API integration, multi-provider LLM routing, pgvector retrieval, and cost-aware inference.</w:t>
-        </w:r>
-      </w:hyperlink>
+      <w:r>
+        <w:rPr>
+          <w:b w:val="0"/>
+        </w:rPr>
+        <w:t>Built a production GenAI platform on AWS Bedrock (Claude 3 / Titan) with pgvector semantic retrieval, multi-provider LLM routing, and cost-aware inference.</w:t>
+      </w:r>
     </w:p>
     <w:p>
       <w:pPr>
@@ -2104,7 +1384,7 @@
           <w:numId w:val="1"/>
         </w:numPr>
         <w:shd w:val="clear" w:fill="auto"/>
-        <w:spacing w:lineRule="exact" w:line="283" w:before="0" w:after="0"/>
+        <w:spacing w:lineRule="exact" w:line="283" w:before="0" w:after="40"/>
         <w:ind w:hanging="360" w:start="288" w:end="0"/>
         <w:contextualSpacing/>
         <w:rPr>
@@ -2114,55 +1394,20 @@
           <w:szCs w:val="20"/>
         </w:rPr>
       </w:pPr>
-      <w:hyperlink r:id="rId9">
-        <w:r>
-          <w:rPr>
-            <w:rStyle w:val="Hyperlink"/>
-          </w:rPr>
-          <w:t>Implemented security architectures with AWS Shield, GuardDuty, WAF, IAM, and infrastructure as code using Terraform and CloudFormation.</w:t>
-        </w:r>
-      </w:hyperlink>
+      <w:r>
+        <w:t>Hardened with Terraform, Shield, WAF, GuardDuty, and IAM - end-to-end AWS AI use case.</w:t>
+      </w:r>
     </w:p>
     <w:p>
       <w:pPr>
         <w:pStyle w:val="normal1"/>
-        <w:keepNext w:val="false"/>
-        <w:keepLines w:val="false"/>
-        <w:pageBreakBefore w:val="false"/>
-        <w:numPr>
-          <w:ilvl w:val="0"/>
-          <w:numId w:val="1"/>
-        </w:numPr>
-        <w:shd w:val="clear" w:fill="auto"/>
-        <w:spacing w:lineRule="exact" w:line="283" w:before="0" w:after="0"/>
-        <w:ind w:hanging="360" w:start="288" w:end="0"/>
-        <w:contextualSpacing/>
-        <w:rPr>
-          <w:rFonts w:eastAsia="Calibri" w:cs="Calibri"/>
-          <w:color w:val="000000"/>
-          <w:sz w:val="21"/>
-          <w:szCs w:val="20"/>
-        </w:rPr>
-      </w:pPr>
-      <w:hyperlink r:id="rId10">
-        <w:r>
-          <w:rPr>
-            <w:rStyle w:val="Hyperlink"/>
-          </w:rPr>
-          <w:t>Interactive options Greeks playground with Black-Scholes pricing approximation.</w:t>
-        </w:r>
-      </w:hyperlink>
+        <w:spacing w:lineRule="exact" w:line="283" w:before="0" w:after="40"/>
+      </w:pPr>
     </w:p>
     <w:p>
       <w:pPr>
         <w:pStyle w:val="normal1"/>
-        <w:spacing w:lineRule="exact" w:line="283" w:before="0" w:after="0"/>
-      </w:pPr>
-    </w:p>
-    <w:p>
-      <w:pPr>
-        <w:pStyle w:val="normal1"/>
-        <w:spacing w:lineRule="auto" w:line="240" w:before="0" w:after="40"/>
+        <w:spacing w:lineRule="auto" w:line="240" w:before="80" w:after="40"/>
         <w:rPr/>
       </w:pPr>
       <w:r>
@@ -2183,12 +1428,7 @@
         <w:rPr/>
       </w:pPr>
       <w:r>
-        <w:rPr>
-          <w:rFonts w:eastAsia="Calibri" w:cs="Calibri"/>
-          <w:sz w:val="21"/>
-          <w:szCs w:val="21"/>
-        </w:rPr>
-        <w:t>AWS Certified Solutions Architect - Associate (ID 505325920)</w:t>
+        <w:t>AWS Certified Generative AI Developer - Professional</w:t>
       </w:r>
     </w:p>
     <w:p>
@@ -2196,7 +1436,15 @@
         <w:spacing w:before="0" w:after="40" w:line="240" w:lineRule="auto"/>
       </w:pPr>
       <w:r>
-        <w:t>AWS Certified AI Practitioner (ID 529856606)</w:t>
+        <w:t>AWS Certified Solutions Architect - Associate</w:t>
+      </w:r>
+    </w:p>
+    <w:p>
+      <w:pPr>
+        <w:spacing w:before="0" w:after="40" w:line="240" w:lineRule="auto"/>
+      </w:pPr>
+      <w:r>
+        <w:t>AWS Certified AI Practitioner</w:t>
       </w:r>
     </w:p>
     <w:p>
@@ -2226,7 +1474,7 @@
           <w:sz w:val="21"/>
           <w:szCs w:val="21"/>
         </w:rPr>
-        <w:t>Cisco Certified Network Professional (CCNP) (ID CSCO12543177)</w:t>
+        <w:t>Cisco Certified Network Professional (CCNP)</w:t>
       </w:r>
     </w:p>
     <w:p>
@@ -2254,7 +1502,7 @@
     <w:p>
       <w:pPr>
         <w:pStyle w:val="normal1"/>
-        <w:spacing w:lineRule="auto" w:line="240" w:before="0" w:after="40"/>
+        <w:spacing w:lineRule="auto" w:line="240" w:before="80" w:after="40"/>
         <w:rPr/>
       </w:pPr>
       <w:r>

</xml_diff>

<commit_message>
Refine resume headline and experience
</commit_message>
<xml_diff>
--- a/public/resume/Giovanni_Tammaro_Resume.docx
+++ b/public/resume/Giovanni_Tammaro_Resume.docx
@@ -118,7 +118,7 @@
         <w:rPr>
           <w:rFonts w:ascii="Calibri" w:hAnsi="Calibri"/>
         </w:rPr>
-        <w:t>AWS-Certified Cloud &amp; AI Engineer with 20+ years of infrastructure experience, including 4 years at Amazon Web Services (Dublin). From January 2022 to August 2026, I have focused on building production-oriented GenAI systems on Amazon Bedrock, including RAG pipelines, vector retrieval, LLM routing, grounded responses, evaluation patterns, security guardrails, and cost-aware operations. Strong in Python, FastAPI, AWS-native architecture, and end-to-end delivery from design to production.</w:t>
+        <w:t>AWS-Certified Cloud &amp; AI Engineer with 20+ years of infrastructure experience, including 6 years at Amazon Web Services (Dublin). From January 2022 to August 2026, I have focused on building production-oriented GenAI systems on Amazon Bedrock, including RAG pipelines, vector retrieval, LLM routing, grounded responses, evaluation patterns, security guardrails, and cost-aware operations. Strong in Python, FastAPI, AWS-native architecture, and end-to-end delivery from design to production.</w:t>
       </w:r>
     </w:p>
     <w:p>
@@ -322,7 +322,7 @@
           <w:sz w:val="21"/>
           <w:szCs w:val="21"/>
         </w:rPr>
-        <w:t>AWS Cloud Engineer - Independent Projects</w:t>
+        <w:t>AWS AI &amp; AI Infrastructure Engineer - Independent Projects</w:t>
       </w:r>
     </w:p>
     <w:p>

</xml_diff>

<commit_message>
Refine resume AI infrastructure focus
</commit_message>
<xml_diff>
--- a/public/resume/Giovanni_Tammaro_Resume.docx
+++ b/public/resume/Giovanni_Tammaro_Resume.docx
@@ -376,7 +376,7 @@
         <w:rPr/>
       </w:pPr>
       <w:r>
-        <w:t>Evolved an AWS-hosted RAG operations platform with a React frontend on CloudFront and a containerized FastAPI backend on ECS Fargate, connected to Aurora and designed to expose end-to-end ingestion workflows, operational visibility, and automated gap analysis across the document pipeline.</w:t>
+        <w:t>Evolved an AWS-hosted RAG platform with a React frontend on CloudFront and a containerized FastAPI backend on ECS Fargate, connected to Aurora for end-to-end ingestion workflows, automated gap analysis, and operational visibility.</w:t>
       </w:r>
     </w:p>
     <w:p>
@@ -398,25 +398,7 @@
         <w:rPr/>
       </w:pPr>
       <w:r>
-        <w:rPr>
-          <w:rFonts w:eastAsia="Calibri" w:cs="Calibri"/>
-          <w:b w:val="false"/>
-          <w:bCs w:val="false"/>
-          <w:i w:val="false"/>
-          <w:iCs w:val="false"/>
-          <w:caps w:val="false"/>
-          <w:smallCaps w:val="false"/>
-          <w:strike w:val="false"/>
-          <w:dstrike w:val="false"/>
-          <w:color w:val="000000"/>
-          <w:position w:val="0"/>
-          <w:sz w:val="21"/>
-          <w:szCs w:val="20"/>
-          <w:u w:val="none"/>
-          <w:shd w:fill="auto" w:val="clear"/>
-          <w:vertAlign w:val="baseline"/>
-        </w:rPr>
-        <w:t>Expanded the ingestion pipeline to support both text-based and scanned PDFs, introducing Docling and AWS Nova Pro-based document understanding to improve semantic extraction and retrieval quality on previously low-coverage documents.</w:t>
+        <w:t>Expanded ingestion to support both text-based and scanned PDFs, adding Docling and AWS Nova Pro-based document understanding to improve semantic extraction and retrieval quality on low-coverage documents.</w:t>
       </w:r>
     </w:p>
     <w:p>
@@ -438,25 +420,7 @@
         <w:rPr/>
       </w:pPr>
       <w:r>
-        <w:rPr>
-          <w:rFonts w:eastAsia="Calibri" w:cs="Calibri"/>
-          <w:b w:val="false"/>
-          <w:bCs w:val="false"/>
-          <w:i w:val="false"/>
-          <w:iCs w:val="false"/>
-          <w:caps w:val="false"/>
-          <w:smallCaps w:val="false"/>
-          <w:strike w:val="false"/>
-          <w:dstrike w:val="false"/>
-          <w:color w:val="000000"/>
-          <w:position w:val="0"/>
-          <w:sz w:val="21"/>
-          <w:szCs w:val="20"/>
-          <w:u w:val="none"/>
-          <w:shd w:fill="auto" w:val="clear"/>
-          <w:vertAlign w:val="baseline"/>
-        </w:rPr>
-        <w:t>Led a full revamp of the ingestion layer, adding automated reconciliation, gap analysis, and real-time ingestion monitoring to improve data quality, freshness, and downstream AI reliability.</w:t>
+        <w:t>Revamped the ingestion layer with automated reconciliation, gap analysis, and real-time monitoring, improving data freshness, pipeline visibility, and downstream AI reliability.</w:t>
       </w:r>
     </w:p>
     <w:p>
@@ -478,25 +442,7 @@
         <w:rPr/>
       </w:pPr>
       <w:r>
-        <w:rPr>
-          <w:rFonts w:eastAsia="Calibri" w:cs="Calibri"/>
-          <w:b w:val="false"/>
-          <w:bCs w:val="false"/>
-          <w:i w:val="false"/>
-          <w:iCs w:val="false"/>
-          <w:caps w:val="false"/>
-          <w:smallCaps w:val="false"/>
-          <w:strike w:val="false"/>
-          <w:dstrike w:val="false"/>
-          <w:color w:val="000000"/>
-          <w:position w:val="0"/>
-          <w:sz w:val="21"/>
-          <w:szCs w:val="20"/>
-          <w:u w:val="none"/>
-          <w:shd w:fill="auto" w:val="clear"/>
-          <w:vertAlign w:val="baseline"/>
-        </w:rPr>
-        <w:t>Improved RAG latency and efficiency through retrieval and caching optimizations, including pg_prewarm, stronger keyword handling, and more efficient query flows across frequently accessed document sets.</w:t>
+        <w:t>Strengthened observability with AWS CloudWatch and X-Ray, ingesting telemetry and traces for real-time ingestion monitoring, threshold-based alerting, and faster issue detection across the RAG pipeline.</w:t>
       </w:r>
     </w:p>
     <w:p>
@@ -518,25 +464,7 @@
         <w:rPr/>
       </w:pPr>
       <w:r>
-        <w:rPr>
-          <w:rFonts w:eastAsia="Calibri" w:cs="Calibri"/>
-          <w:b w:val="false"/>
-          <w:bCs w:val="false"/>
-          <w:i w:val="false"/>
-          <w:iCs w:val="false"/>
-          <w:caps w:val="false"/>
-          <w:smallCaps w:val="false"/>
-          <w:strike w:val="false"/>
-          <w:dstrike w:val="false"/>
-          <w:color w:val="000000"/>
-          <w:position w:val="0"/>
-          <w:sz w:val="21"/>
-          <w:szCs w:val="20"/>
-          <w:u w:val="none"/>
-          <w:shd w:fill="auto" w:val="clear"/>
-          <w:vertAlign w:val="baseline"/>
-        </w:rPr>
-        <w:t>Designed and implemented metadata editing, audit-trail, and collection-scoping capabilities, increasing transparency and enabling more precise queries across targeted financial datasets.</w:t>
+        <w:t>Improved RAG latency and retrieval efficiency through caching and retrieval optimizations, including pg_prewarm, stronger keyword handling, and more efficient query flows across frequently accessed datasets.</w:t>
       </w:r>
     </w:p>
     <w:p>
@@ -558,52 +486,29 @@
         <w:rPr/>
       </w:pPr>
       <w:r>
-        <w:rPr>
-          <w:rFonts w:eastAsia="Calibri" w:cs="Calibri"/>
-          <w:b w:val="false"/>
-          <w:bCs w:val="false"/>
-          <w:i w:val="false"/>
-          <w:iCs w:val="false"/>
-          <w:caps w:val="false"/>
-          <w:smallCaps w:val="false"/>
-          <w:strike w:val="false"/>
-          <w:dstrike w:val="false"/>
-          <w:color w:val="000000"/>
-          <w:position w:val="0"/>
-          <w:sz w:val="21"/>
-          <w:szCs w:val="20"/>
-          <w:u w:val="none"/>
-          <w:shd w:fill="auto" w:val="clear"/>
-          <w:vertAlign w:val="baseline"/>
-        </w:rPr>
-        <w:t>Introduced RAG evaluation workflows with RAGAS to measure retrieval and answer quality, support regression detection, and improve the reliability of the overall RAG system.</w:t>
+        <w:t>Designed metadata editing, audit-trail, and collection-scoping capabilities, improving transparency and enabling more precise queries across targeted financial datasets.</w:t>
       </w:r>
     </w:p>
     <w:p>
       <w:pPr>
         <w:pStyle w:val="normal1"/>
-        <w:spacing w:lineRule="auto" w:line="240" w:before="0" w:after="40"/>
+        <w:keepNext w:val="false"/>
+        <w:keepLines w:val="false"/>
+        <w:pageBreakBefore w:val="false"/>
+        <w:widowControl/>
+        <w:numPr>
+          <w:ilvl w:val="0"/>
+          <w:numId w:val="1"/>
+        </w:numPr>
+        <w:shd w:val="clear" w:fill="auto"/>
+        <w:spacing w:lineRule="exact" w:line="283" w:before="0" w:after="40"/>
+        <w:ind w:hanging="360" w:start="288" w:end="0"/>
+        <w:contextualSpacing/>
+        <w:jc w:val="start"/>
         <w:rPr/>
       </w:pPr>
       <w:r>
-        <w:rPr/>
-      </w:r>
-    </w:p>
-    <w:p>
-      <w:pPr>
-        <w:pStyle w:val="normal1"/>
-        <w:spacing w:lineRule="auto" w:line="240" w:before="0" w:after="40"/>
-        <w:rPr/>
-      </w:pPr>
-      <w:r>
-        <w:rPr>
-          <w:rFonts w:eastAsia="Calibri" w:cs="Calibri"/>
-          <w:b/>
-          <w:bCs/>
-          <w:sz w:val="21"/>
-          <w:szCs w:val="21"/>
-        </w:rPr>
-        <w:t>Network Automation Engineer</w:t>
+        <w:t>Introduced RAG evaluation workflows with RAGAS to measure retrieval and answer quality, support regression detection, and improve overall RAG reliability.</w:t>
       </w:r>
     </w:p>
     <w:p>

</xml_diff>

<commit_message>
Refine resume summary and role title
</commit_message>
<xml_diff>
--- a/public/resume/Giovanni_Tammaro_Resume.docx
+++ b/public/resume/Giovanni_Tammaro_Resume.docx
@@ -118,7 +118,7 @@
         <w:rPr>
           <w:rFonts w:ascii="Calibri" w:hAnsi="Calibri"/>
         </w:rPr>
-        <w:t>AWS-Certified Cloud &amp; AI Engineer with 20+ years of infrastructure experience, including 6 years at Amazon Web Services (Dublin). From January 2022 to August 2026, I have focused on building production-oriented GenAI systems on Amazon Bedrock, including RAG pipelines, vector retrieval, LLM routing, grounded responses, evaluation patterns, security guardrails, and cost-aware operations. Strong in Python, FastAPI, AWS-native architecture, and end-to-end delivery from design to production.</w:t>
+        <w:t>AWS-Certified AI &amp; Infrastructure Engineer with 20+ years of infrastructure experience, including 6 years at Amazon Web Services (Dublin). Since 2022, I have focused on AI systems and infrastructure, with hands-on work on GenAI platforms spanning RAG pipelines, LLM integrations, vector retrieval, observability, and RAG evaluation. Strong in Python, FastAPI, AWS-native AI infrastructure, and end-to-end delivery from architecture to production.</w:t>
       </w:r>
     </w:p>
     <w:p>
@@ -301,7 +301,7 @@
           <w:sz w:val="21"/>
           <w:szCs w:val="21"/>
         </w:rPr>
-        <w:t>AWS AI &amp; AI Infrastructure Engineer - Independent Projects</w:t>
+        <w:t>AWS AI &amp; AI Infrastructure Engineer - Freelance</w:t>
       </w:r>
     </w:p>
     <w:p>

</xml_diff>